<commit_message>
Rasterize figures to PNG (render in all Word versions) + add copy-paste Word-LaTeX equations
- fxts_simulate.py: pure-Python PNG encoder + bitmap-font plotter; emits real PNG twins of each SVG
- build_fxts_docx.py: embed real PNG as blip (draws everywhere) with SVG overlay for Word 365
- FXTS_Equations_WordLaTeX.md: all 120 equations sanitized to Word equation-editor LaTeX (copy-paste)
- Manuscript: added colour keys to the 7 figure captions
</commit_message>
<xml_diff>
--- a/FXTS_Delayed_CGBAM_Manuscript.docx
+++ b/FXTS_Delayed_CGBAM_Manuscript.docx
@@ -2765,7 +2765,7 @@
       </w:r>
       <w:r>
         <w:rPr/>
-        <w:t xml:space="preserve"> Cyber-physical system (64) with neither controller nor deception attack: the two signals x_1(t),x_2(t) remain bounded but do not settle to the origin (initial state x_1(0)=0.2, x_2(0)=0.1).</w:t>
+        <w:t xml:space="preserve"> Cyber-physical system (64) with neither controller nor deception attack: the two signals x_1(t),x_2(t) remain bounded but do not settle to the origin (initial state x_1(0)=0.2, x_2(0)=0.1). Colour key: blue =x_1(t), red =x_2(t).</w:t>
       </w:r>
     </w:p>
     <w:p>
@@ -2824,7 +2824,7 @@
       </w:r>
       <w:r>
         <w:rPr/>
-        <w:t xml:space="preserve"> System (64) under destabilizing impulsive attacks (\xi=1.2, sequence (66) with \tau_a=2,N_0=2,h=0.1) and no control: the states grow without bound.</w:t>
+        <w:t xml:space="preserve"> System (64) under destabilizing impulsive attacks (\xi=1.2, sequence (66) with \tau_a=2,N_0=2,h=0.1) and no control: the states grow without bound. Colour key: blue =x_1(t), red =x_2(t).</w:t>
       </w:r>
     </w:p>
     <w:p>
@@ -2883,7 +2883,7 @@
       </w:r>
       <w:r>
         <w:rPr/>
-        <w:t xml:space="preserve"> System (64) with controller (65) and \tau_a=1&gt;0.536: fixed-time convergence to the origin; the dashed line marks the observed settling time T\approx 1.10, within the estimate (72).</w:t>
+        <w:t xml:space="preserve"> System (64) with controller (65) and \tau_a=1&gt;0.536: fixed-time convergence to the origin; the dashed line marks the observed settling time T\approx 1.10, within the estimate (72). Colour key: blue =x_1(t), red =x_2(t).</w:t>
       </w:r>
     </w:p>
     <w:p>
@@ -2942,7 +2942,7 @@
       </w:r>
       <w:r>
         <w:rPr/>
-        <w:t xml:space="preserve"> System (64) with controller (65) but \tau_a=0.1&lt;0.536 (condition (71) violated): the destabilizing impulses prevent convergence.</w:t>
+        <w:t xml:space="preserve"> System (64) with controller (65) but \tau_a=0.1&lt;0.536 (condition (71) violated): the destabilizing impulses prevent convergence. Colour key: blue =x_1(t), red =x_2(t).</w:t>
       </w:r>
     </w:p>
     <w:p>
@@ -3646,7 +3646,7 @@
       </w:r>
       <w:r>
         <w:rPr/>
-        <w:t xml:space="preserve"> Delayed CGBAMNN (74) without control: the four states oscillate and do not converge (initial state (1.5,-1.0,-1.5,1.0), delays \sigma=\rho=0.2).</w:t>
+        <w:t xml:space="preserve"> Delayed CGBAMNN (74) without control: the four states oscillate and do not converge (initial state (1.5,-1.0,-1.5,1.0), delays \sigma=\rho=0.2). Colour key: blue =x_1(t), red =x_2(t), green =y_1(t), purple =y_2(t).</w:t>
       </w:r>
     </w:p>
     <w:p>
@@ -3705,7 +3705,7 @@
       </w:r>
       <w:r>
         <w:rPr/>
-        <w:t xml:space="preserve"> Delayed CGBAMNN (74) with the first controller (38), \xi=1.1, \tau_a=0.8&gt;0.172: fixed-time convergence; dashed line marks the observed settling time T\approx 0.68, within the estimate (88).</w:t>
+        <w:t xml:space="preserve"> Delayed CGBAMNN (74) with the first controller (38), \xi=1.1, \tau_a=0.8&gt;0.172: fixed-time convergence; dashed line marks the observed settling time T\approx 0.68, within the estimate (88). Colour key: blue =x_1(t), red =x_2(t), green =y_1(t), purple =y_2(t).</w:t>
       </w:r>
     </w:p>
     <w:p>
@@ -4740,7 +4740,7 @@
       </w:r>
       <w:r>
         <w:rPr/>
-        <w:t xml:space="preserve"> Delayed CGBAMNN (74): maximum state magnitude under the second controller (51) with its linear term (converges in fixed time, T\approx 0.58) versus the ablated controller (95) without the linear term (does not converge), under the same impulsive sequence (\tilde\xi=1.44, \tau_a=0.5).</w:t>
+        <w:t xml:space="preserve"> Delayed CGBAMNN (74): maximum state magnitude under the second controller (51) with its linear term (converges in fixed time, T\approx 0.58) versus the ablated controller (95) without the linear term (does not converge), under the same impulsive sequence (\tilde\xi=1.44, \tau_a=0.5). Colour key: blue = full controller (51), red = ablated controller (95).</w:t>
       </w:r>
     </w:p>
     <w:p>

</xml_diff>